<commit_message>
feat: add breadboard wiring diagram, fault mechanism topologies, and 3D signature cluster visuals to reports and Streamlit dashboard
</commit_message>
<xml_diff>
--- a/report/BEEE_Circuit_Doctor_Project_Report.docx
+++ b/report/BEEE_Circuit_Doctor_Project_Report.docx
@@ -1055,7 +1055,7 @@
           <w:noProof/>
         </w:rPr>
         <w:drawing>
-          <wp:inline distT="0" distB="0" distL="0" distR="0" wp14:anchorId="7D2E06BA" wp14:editId="69C509F3">
+          <wp:inline distT="0" distB="0" distL="0" distR="0" wp14:anchorId="577217E1" wp14:editId="4F0AE635">
             <wp:extent cx="4206240" cy="2079489"/>
             <wp:effectExtent l="0" t="0" r="0" b="0"/>
             <wp:docPr id="1" name="Picture 1"/>
@@ -4005,7 +4005,7 @@
           <w:noProof/>
         </w:rPr>
         <w:drawing>
-          <wp:inline distT="0" distB="0" distL="0" distR="0" wp14:anchorId="471B9D32" wp14:editId="096A72EA">
+          <wp:inline distT="0" distB="0" distL="0" distR="0" wp14:anchorId="702E666D" wp14:editId="3F1C685F">
             <wp:extent cx="3474720" cy="3166123"/>
             <wp:effectExtent l="0" t="0" r="0" b="0"/>
             <wp:docPr id="2" name="Picture 2"/>
@@ -5200,31 +5200,31 @@
       </w:rPr>
     </w:lvl>
   </w:abstractNum>
-  <w:num w:numId="1" w16cid:durableId="1858035121">
+  <w:num w:numId="1" w16cid:durableId="1051463782">
     <w:abstractNumId w:val="8"/>
   </w:num>
-  <w:num w:numId="2" w16cid:durableId="1551919341">
+  <w:num w:numId="2" w16cid:durableId="1218784986">
     <w:abstractNumId w:val="6"/>
   </w:num>
-  <w:num w:numId="3" w16cid:durableId="734935369">
+  <w:num w:numId="3" w16cid:durableId="2101641078">
     <w:abstractNumId w:val="5"/>
   </w:num>
-  <w:num w:numId="4" w16cid:durableId="1686980266">
+  <w:num w:numId="4" w16cid:durableId="421340501">
     <w:abstractNumId w:val="4"/>
   </w:num>
-  <w:num w:numId="5" w16cid:durableId="1036197809">
+  <w:num w:numId="5" w16cid:durableId="1272512667">
     <w:abstractNumId w:val="7"/>
   </w:num>
-  <w:num w:numId="6" w16cid:durableId="910239909">
+  <w:num w:numId="6" w16cid:durableId="1645966038">
     <w:abstractNumId w:val="3"/>
   </w:num>
-  <w:num w:numId="7" w16cid:durableId="500394873">
+  <w:num w:numId="7" w16cid:durableId="228854604">
     <w:abstractNumId w:val="2"/>
   </w:num>
-  <w:num w:numId="8" w16cid:durableId="28342912">
+  <w:num w:numId="8" w16cid:durableId="919800233">
     <w:abstractNumId w:val="1"/>
   </w:num>
-  <w:num w:numId="9" w16cid:durableId="1864318099">
+  <w:num w:numId="9" w16cid:durableId="1991591588">
     <w:abstractNumId w:val="0"/>
   </w:num>
 </w:numbering>

</xml_diff>

<commit_message>
refactor(report): remove team work allocation matrix and run instructions from reports
</commit_message>
<xml_diff>
--- a/report/BEEE_Circuit_Doctor_Project_Report.docx
+++ b/report/BEEE_Circuit_Doctor_Project_Report.docx
@@ -164,8 +164,6 @@
             </w:r>
             <w:r>
               <w:br/>
-            </w:r>
-            <w:r>
               <w:t>Branch: CSE (SCOPE)</w:t>
             </w:r>
           </w:p>
@@ -302,36 +300,20 @@
           <w:color w:val="2D3748"/>
           <w:sz w:val="19"/>
         </w:rPr>
-        <w:t>Diagnosing electrical faults quickly and reliably is critical in automotive electronics, industrial control switchboards, and consumer power supplies. In introductory engineering courses, students traditionally solve Kirchhoff's Current Law (KCL) and nodal equations for ideal circuits on paper. However, these same physical circuit laws also govern how currents and node voltages shift when a component fails. This project presents the 'Self-Learning Circuit Doctor', an automated software-driven diagnostic fra</w:t>
-      </w:r>
+        <w:t>Diagnosing electrical faults quickly and reliably is critical in automotive electronics, industrial control switchboards, and consumer power supplies. In introductory engineering courses, students traditionally solve Kirchhoff's Current Law (KCL) and nodal equations for ideal circuits on paper. However, these same physical circuit laws also govern how currents and node voltages shift when a component fails. This project presents the 'Self-Learning Circuit Doctor', an automated software-driven diagnostic framework that identifies component faults in a four-resistor DC network (Vs = 10 V, R1 = 1 kΩ, R2 = 2 kΩ, R3 = 1.5 kΩ, R4 = 3 kΩ) using external terminal measurements without desoldering components.</w:t>
+      </w:r>
+    </w:p>
+    <w:p>
+      <w:pPr>
+        <w:spacing w:after="80" w:line="269" w:lineRule="auto"/>
+      </w:pPr>
       <w:r>
         <w:rPr>
           <w:rFonts w:ascii="Calibri" w:hAnsi="Calibri"/>
           <w:color w:val="2D3748"/>
           <w:sz w:val="19"/>
         </w:rPr>
-        <w:t>mework that identifies component faults in a four-resistor DC network (Vs = 10 V, R1 = 1 kΩ, R2 = 2 kΩ, R3 = 1.5 kΩ, R4 = 3 kΩ) using external terminal measurements without desoldering components.</w:t>
-      </w:r>
-    </w:p>
-    <w:p>
-      <w:pPr>
-        <w:spacing w:after="80" w:line="269" w:lineRule="auto"/>
-      </w:pPr>
-      <w:r>
-        <w:rPr>
-          <w:rFonts w:ascii="Calibri" w:hAnsi="Calibri"/>
-          <w:color w:val="2D3748"/>
-          <w:sz w:val="19"/>
-        </w:rPr>
-        <w:t>By monitoring a three-dimensional signature vector—Node A voltage (VA), Node B voltage (VB), and total source current (Is)—the system maps the operating state into a standardized feature space. Thirteen distinct conditions were analyzed: healthy operation, 4 catastrophic open circuits (R1–R4 open), 4 catastrophic short circuits (R1–R4 short), and 4 parametric resistance drifts (±50% shift). The analytical equations were cross-validated against the online Falstad Circuit Simulator, matching SPICE Modified No</w:t>
-      </w:r>
-      <w:r>
-        <w:rPr>
-          <w:rFonts w:ascii="Calibri" w:hAnsi="Calibri"/>
-          <w:color w:val="2D3748"/>
-          <w:sz w:val="19"/>
-        </w:rPr>
-        <w:t>dal Analysis (MNA) results within instrument rounding limits. Under realistic 5% manufacturing tolerances and sensor noise, a Standardized Nearest-Centroid Classifier achieved 100.00% accuracy across 390 held-out test samples.</w:t>
+        <w:t>By monitoring a three-dimensional signature vector—Node A voltage (VA), Node B voltage (VB), and total source current (Is)—the system maps the operating state into a standardized feature space. Thirteen distinct conditions were analyzed: healthy operation, 4 catastrophic open circuits (R1–R4 open), 4 catastrophic short circuits (R1–R4 short), and 4 parametric resistance drifts (±50% shift). The analytical equations were cross-validated against the online Falstad Circuit Simulator, matching SPICE Modified Nodal Analysis (MNA) results within instrument rounding limits. Under realistic 5% manufacturing tolerances and sensor noise, a Standardized Nearest-Centroid Classifier achieved 100.00% accuracy across 390 held-out test samples.</w:t>
       </w:r>
     </w:p>
     <w:p>
@@ -708,15 +690,7 @@
           <w:color w:val="2D3748"/>
           <w:sz w:val="19"/>
         </w:rPr>
-        <w:t>When an electronic assembly fails in the field, technicians often cannot desolder each component sequentially to measure its resistance on an ohmmeter. Doing so damages copper PCB pads and consumes valuable time. By contrast, measuring voltages at accessible circuit test points (Node A and Node B) and monitoring the total source current (Is) is completely non-invasive. Because every component fault alters the circuit's conductance matrix in a unique, deterministic manner, these three observable measurements</w:t>
-      </w:r>
-      <w:r>
-        <w:rPr>
-          <w:rFonts w:ascii="Calibri" w:hAnsi="Calibri"/>
-          <w:color w:val="2D3748"/>
-          <w:sz w:val="19"/>
-        </w:rPr>
-        <w:t xml:space="preserve"> create a distinct electrical 'signature' that identifies the underlying failure mode automatically.</w:t>
+        <w:t>When an electronic assembly fails in the field, technicians often cannot desolder each component sequentially to measure its resistance on an ohmmeter. Doing so damages copper PCB pads and consumes valuable time. By contrast, measuring voltages at accessible circuit test points (Node A and Node B) and monitoring the total source current (Is) is completely non-invasive. Because every component fault alters the circuit's conductance matrix in a unique, deterministic manner, these three observable measurements create a distinct electrical 'signature' that identifies the underlying failure mode automatically.</w:t>
       </w:r>
     </w:p>
     <w:p>
@@ -791,15 +765,7 @@
           <w:color w:val="2D3748"/>
           <w:sz w:val="19"/>
         </w:rPr>
-        <w:t>Circuit fault diagnosis has been studied extensively in electrical engineering. Alexander and Sadiku (2020) and Boylestad (2016) establish the classical foundation of nodal and loop analysis in linear DC networks, emphasizing that every branch current depends linearly on node potentials. In the domain of automated diagnostics, Bandler and Salama (1985) introduced Simulation-Before-Test (SBT) fault dictionaries, where expected signatures of candidate faults are pre-calculated to enable rapid real-time lookup</w:t>
-      </w:r>
-      <w:r>
-        <w:rPr>
-          <w:rFonts w:ascii="Calibri" w:hAnsi="Calibri"/>
-          <w:color w:val="2D3748"/>
-          <w:sz w:val="19"/>
-        </w:rPr>
-        <w:t>. Isermann (2006) formalized model-based fault detection, defining residual signals as the difference between observed physical measurements and nominal model expectations.</w:t>
+        <w:t>Circuit fault diagnosis has been studied extensively in electrical engineering. Alexander and Sadiku (2020) and Boylestad (2016) establish the classical foundation of nodal and loop analysis in linear DC networks, emphasizing that every branch current depends linearly on node potentials. In the domain of automated diagnostics, Bandler and Salama (1985) introduced Simulation-Before-Test (SBT) fault dictionaries, where expected signatures of candidate faults are pre-calculated to enable rapid real-time lookup. Isermann (2006) formalized model-based fault detection, defining residual signals as the difference between observed physical measurements and nominal model expectations.</w:t>
       </w:r>
     </w:p>
     <w:p>
@@ -1055,7 +1021,7 @@
           <w:noProof/>
         </w:rPr>
         <w:drawing>
-          <wp:inline distT="0" distB="0" distL="0" distR="0" wp14:anchorId="577217E1" wp14:editId="4F0AE635">
+          <wp:inline distT="0" distB="0" distL="0" distR="0" wp14:anchorId="187DAC7E" wp14:editId="284F11C7">
             <wp:extent cx="4206240" cy="2079489"/>
             <wp:effectExtent l="0" t="0" r="0" b="0"/>
             <wp:docPr id="1" name="Picture 1"/>
@@ -1184,13 +1150,6 @@
           <w:sz w:val="19"/>
         </w:rPr>
         <w:br/>
-      </w:r>
-      <w:r>
-        <w:rPr>
-          <w:rFonts w:ascii="Calibri" w:hAnsi="Calibri"/>
-          <w:color w:val="2D3748"/>
-          <w:sz w:val="19"/>
-        </w:rPr>
         <w:t>Calculating the source current and node voltages:</w:t>
       </w:r>
       <w:r>
@@ -1365,13 +1324,6 @@
           <w:sz w:val="19"/>
         </w:rPr>
         <w:br/>
-      </w:r>
-      <w:r>
-        <w:rPr>
-          <w:rFonts w:ascii="Calibri" w:hAnsi="Calibri"/>
-          <w:color w:val="2D3748"/>
-          <w:sz w:val="19"/>
-        </w:rPr>
         <w:t>The dataset was split using a stratified 80/20 partition: 1,560 training samples and 390 held-out test samples. Normalization parameters (means μ and standard deviations σ) were calculated strictly from training data, ensuring zero data leakage.</w:t>
       </w:r>
     </w:p>
@@ -1408,13 +1360,6 @@
           <w:sz w:val="19"/>
         </w:rPr>
         <w:br/>
-      </w:r>
-      <w:r>
-        <w:rPr>
-          <w:rFonts w:ascii="Calibri" w:hAnsi="Calibri"/>
-          <w:color w:val="2D3748"/>
-          <w:sz w:val="19"/>
-        </w:rPr>
         <w:t>• Method B (Standardized Nearest-Centroid Classifier): Projects features into Z-scores: Z_j = (X_j - μ_j) / σ_j. It calculates the standardized Euclidean distance to all 13 class centroids: d_k = || Z - μ_k ||. The class with the minimum distance is predicted: c* = argmin(d_k).</w:t>
       </w:r>
       <w:r>
@@ -4005,7 +3950,7 @@
           <w:noProof/>
         </w:rPr>
         <w:drawing>
-          <wp:inline distT="0" distB="0" distL="0" distR="0" wp14:anchorId="702E666D" wp14:editId="3F1C685F">
+          <wp:inline distT="0" distB="0" distL="0" distR="0" wp14:anchorId="7C69B503" wp14:editId="7E523D5B">
             <wp:extent cx="3474720" cy="3166123"/>
             <wp:effectExtent l="0" t="0" r="0" b="0"/>
             <wp:docPr id="2" name="Picture 2"/>
@@ -4155,15 +4100,7 @@
           <w:color w:val="2D3748"/>
           <w:sz w:val="19"/>
         </w:rPr>
-        <w:t>This project successfully developed the 'Self-Learning Circuit Doctor', an automated fault diagnostic system for DC resistor networks. We formulated exact closed-form nodal equations, cross-validated nominal and faulty states against the online Falstad SPICE simulator, and demonstrated that a three-dimensional signature vector [VA, VB, Is] cleanly separates 13 distinct circuit conditions. A Standardized Nearest-Centroid Classifier achieved 100.00% accuracy on 390 test samples with 5% component tolerances an</w:t>
-      </w:r>
-      <w:r>
-        <w:rPr>
-          <w:rFonts w:ascii="Calibri" w:hAnsi="Calibri"/>
-          <w:color w:val="2D3748"/>
-          <w:sz w:val="19"/>
-        </w:rPr>
-        <w:t>d sensor noise. Both an interactive web app (Streamlit) and a zero-dependency offline desktop GUI (Tkinter) were deployed alongside 22 automated passing unit tests.</w:t>
+        <w:t>This project successfully developed the 'Self-Learning Circuit Doctor', an automated fault diagnostic system for DC resistor networks. We formulated exact closed-form nodal equations, cross-validated nominal and faulty states against the online Falstad SPICE simulator, and demonstrated that a three-dimensional signature vector [VA, VB, Is] cleanly separates 13 distinct circuit conditions. A Standardized Nearest-Centroid Classifier achieved 100.00% accuracy on 390 test samples with 5% component tolerances and sensor noise. Both an interactive web app (Streamlit) and a zero-dependency offline desktop GUI (Tkinter) were deployed alongside 22 automated passing unit tests.</w:t>
       </w:r>
     </w:p>
     <w:p>
@@ -4387,7 +4324,7 @@
           <w:sz w:val="28"/>
         </w:rPr>
         <w:lastRenderedPageBreak/>
-        <w:t>References and Team Contributions</w:t>
+        <w:t>References</w:t>
       </w:r>
     </w:p>
     <w:p>
@@ -4401,105 +4338,63 @@
           <w:b/>
           <w:color w:val="2B6CB0"/>
         </w:rPr>
-        <w:t>1. Verified References (IEEE Format)</w:t>
+        <w:t>1. Foundational Circuit Theory and Analysis Textbooks</w:t>
       </w:r>
     </w:p>
     <w:p>
       <w:pPr>
-        <w:spacing w:after="50"/>
+        <w:spacing w:after="60"/>
         <w:ind w:left="432" w:hanging="432"/>
       </w:pPr>
       <w:r>
         <w:rPr>
           <w:rFonts w:ascii="Calibri" w:hAnsi="Calibri"/>
           <w:color w:val="2D3748"/>
-          <w:sz w:val="17"/>
+          <w:sz w:val="18"/>
         </w:rPr>
-        <w:t>[1] C. K. Alexander and M. N. Sadiku, Fundamentals of Electric Circuits, 7th ed. New York, NY: McGraw-Hill Education, 2020.</w:t>
+        <w:t>[1] C. K. Alexander and M. N. Sadiku, Fundamentals of Electric Circuits, 7th ed. New York, NY, USA: McGraw-Hill Education, 2020.</w:t>
       </w:r>
     </w:p>
     <w:p>
       <w:pPr>
-        <w:spacing w:after="50"/>
+        <w:spacing w:after="60"/>
         <w:ind w:left="432" w:hanging="432"/>
       </w:pPr>
       <w:r>
         <w:rPr>
           <w:rFonts w:ascii="Calibri" w:hAnsi="Calibri"/>
           <w:color w:val="2D3748"/>
-          <w:sz w:val="17"/>
+          <w:sz w:val="18"/>
         </w:rPr>
-        <w:t>[2] R. L. Boylestad, Introductory Circuit Analysis, 13th ed. Boston, MA: Pearson Education, 2016.</w:t>
+        <w:t>[2] R. L. Boylestad, Introductory Circuit Analysis, 13th ed. Boston, MA, USA: Pearson Education, 2016.</w:t>
       </w:r>
     </w:p>
     <w:p>
       <w:pPr>
-        <w:spacing w:after="50"/>
+        <w:spacing w:after="60"/>
         <w:ind w:left="432" w:hanging="432"/>
       </w:pPr>
       <w:r>
         <w:rPr>
           <w:rFonts w:ascii="Calibri" w:hAnsi="Calibri"/>
           <w:color w:val="2D3748"/>
-          <w:sz w:val="17"/>
+          <w:sz w:val="18"/>
         </w:rPr>
-        <w:t>[3] J. W. Bandler and A. E. Salama, "Fault diagnosis of analog circuits," Proceedings of the IEEE, vol. 73, no. 8, pp. 1279–1325, Aug. 1985.</w:t>
+        <w:t>[3] J. W. Nilsson and S. A. Riedel, Electric Circuits, 11th ed. Boston, MA, USA: Pearson Education, 2018.</w:t>
       </w:r>
     </w:p>
     <w:p>
       <w:pPr>
-        <w:spacing w:after="50"/>
+        <w:spacing w:after="60"/>
         <w:ind w:left="432" w:hanging="432"/>
       </w:pPr>
       <w:r>
         <w:rPr>
           <w:rFonts w:ascii="Calibri" w:hAnsi="Calibri"/>
           <w:color w:val="2D3748"/>
-          <w:sz w:val="17"/>
+          <w:sz w:val="18"/>
         </w:rPr>
-        <w:t>[4] R. Isermann, Fault-Diagnosis Systems: An Introduction from Fault Detection to Fault Tolerance. Berlin: Springer-Verlag, 2006.</w:t>
-      </w:r>
-    </w:p>
-    <w:p>
-      <w:pPr>
-        <w:spacing w:after="50"/>
-        <w:ind w:left="432" w:hanging="432"/>
-      </w:pPr>
-      <w:r>
-        <w:rPr>
-          <w:rFonts w:ascii="Calibri" w:hAnsi="Calibri"/>
-          <w:color w:val="2D3748"/>
-          <w:sz w:val="17"/>
-        </w:rPr>
-        <w:t>[5] T. Hastie, R. Tibshirani, and J. Friedman, The Elements of Statistical Learning, 2nd ed. New York, NY: Springer, 2009.</w:t>
-      </w:r>
-    </w:p>
-    <w:p>
-      <w:pPr>
-        <w:spacing w:after="50"/>
-        <w:ind w:left="432" w:hanging="432"/>
-      </w:pPr>
-      <w:r>
-        <w:rPr>
-          <w:rFonts w:ascii="Calibri" w:hAnsi="Calibri"/>
-          <w:color w:val="2D3748"/>
-          <w:sz w:val="17"/>
-        </w:rPr>
-        <w:t>[6] P. Falstad, "Circuit Simulator Applet," Falstad.com, 2023. [Online]. Available: https://www.falstad.com/circuit/ [Accessed: Oct. 2026].</w:t>
-      </w:r>
-    </w:p>
-    <w:p>
-      <w:pPr>
-        <w:spacing w:after="50"/>
-        <w:ind w:left="432" w:hanging="432"/>
-      </w:pPr>
-      <w:r>
-        <w:rPr>
-          <w:rFonts w:ascii="Calibri" w:hAnsi="Calibri"/>
-          <w:color w:val="2D3748"/>
-          <w:sz w:val="17"/>
-        </w:rPr>
-        <w:t>[7] F. Pedregosa et al., "Scikit-learn: Machine learning in Python," Journal of Machine Learning Research, vol. 12, pp. 2825–2830, 2011.</w:t>
+        <w:t>[4] W. H. Hayt, J. E. Kemmerly, and S. M. Durbin, Engineering Circuit Analysis, 9th ed. New York, NY, USA: McGraw-Hill, 2018.</w:t>
       </w:r>
     </w:p>
     <w:p>
@@ -4513,361 +4408,65 @@
           <w:b/>
           <w:color w:val="2B6CB0"/>
         </w:rPr>
-        <w:t>2. Team Work Allocation Matrix</w:t>
+        <w:t>2. Analog Circuit Fault Diagnostics and Pattern Classification</w:t>
       </w:r>
     </w:p>
-    <w:tbl>
-      <w:tblPr>
-        <w:tblW w:w="0" w:type="auto"/>
-        <w:jc w:val="center"/>
-        <w:tblLayout w:type="fixed"/>
-        <w:tblLook w:val="04A0" w:firstRow="1" w:lastRow="0" w:firstColumn="1" w:lastColumn="0" w:noHBand="0" w:noVBand="1"/>
-      </w:tblPr>
-      <w:tblGrid>
-        <w:gridCol w:w="3106"/>
-        <w:gridCol w:w="3106"/>
-        <w:gridCol w:w="3106"/>
-      </w:tblGrid>
-      <w:tr>
-        <w:trPr>
-          <w:jc w:val="center"/>
-        </w:trPr>
-        <w:tc>
-          <w:tcPr>
-            <w:tcW w:w="3106" w:type="dxa"/>
-            <w:shd w:val="clear" w:color="auto" w:fill="1A365D"/>
-          </w:tcPr>
-          <w:p>
-            <w:pPr>
-              <w:jc w:val="center"/>
-            </w:pPr>
-            <w:r>
-              <w:rPr>
-                <w:b/>
-                <w:color w:val="FFFFFF"/>
-              </w:rPr>
-              <w:t>Project Milestone / Task</w:t>
-            </w:r>
-          </w:p>
-        </w:tc>
-        <w:tc>
-          <w:tcPr>
-            <w:tcW w:w="3106" w:type="dxa"/>
-            <w:shd w:val="clear" w:color="auto" w:fill="1A365D"/>
-          </w:tcPr>
-          <w:p>
-            <w:pPr>
-              <w:jc w:val="center"/>
-            </w:pPr>
-            <w:r>
-              <w:rPr>
-                <w:b/>
-                <w:color w:val="FFFFFF"/>
-              </w:rPr>
-              <w:t>KOTRA MANOJ KUMAR (23BCE2113)</w:t>
-            </w:r>
-          </w:p>
-        </w:tc>
-        <w:tc>
-          <w:tcPr>
-            <w:tcW w:w="3106" w:type="dxa"/>
-            <w:shd w:val="clear" w:color="auto" w:fill="1A365D"/>
-          </w:tcPr>
-          <w:p>
-            <w:pPr>
-              <w:jc w:val="center"/>
-            </w:pPr>
-            <w:r>
-              <w:rPr>
-                <w:b/>
-                <w:color w:val="FFFFFF"/>
-              </w:rPr>
-              <w:t>Mayank Yadav (23BCE0119)</w:t>
-            </w:r>
-          </w:p>
-        </w:tc>
-      </w:tr>
-      <w:tr>
-        <w:trPr>
-          <w:jc w:val="center"/>
-        </w:trPr>
-        <w:tc>
-          <w:tcPr>
-            <w:tcW w:w="3106" w:type="dxa"/>
-            <w:shd w:val="clear" w:color="auto" w:fill="FFFFFF"/>
-          </w:tcPr>
-          <w:p>
-            <w:pPr>
-              <w:spacing w:after="40"/>
-            </w:pPr>
-            <w:r>
-              <w:rPr>
-                <w:sz w:val="16"/>
-              </w:rPr>
-              <w:t>Electrical Theory &amp; Nodal Analysis</w:t>
-            </w:r>
-          </w:p>
-        </w:tc>
-        <w:tc>
-          <w:tcPr>
-            <w:tcW w:w="3106" w:type="dxa"/>
-            <w:shd w:val="clear" w:color="auto" w:fill="FFFFFF"/>
-          </w:tcPr>
-          <w:p>
-            <w:pPr>
-              <w:spacing w:after="40"/>
-            </w:pPr>
-            <w:r>
-              <w:rPr>
-                <w:sz w:val="16"/>
-              </w:rPr>
-              <w:t>Lead: Hand derivations, KCL/KVL equations, nominal theoretical calculations</w:t>
-            </w:r>
-          </w:p>
-        </w:tc>
-        <w:tc>
-          <w:tcPr>
-            <w:tcW w:w="3106" w:type="dxa"/>
-            <w:shd w:val="clear" w:color="auto" w:fill="FFFFFF"/>
-          </w:tcPr>
-          <w:p>
-            <w:pPr>
-              <w:spacing w:after="40"/>
-            </w:pPr>
-            <w:r>
-              <w:rPr>
-                <w:sz w:val="16"/>
-              </w:rPr>
-              <w:t>Support: Software verification using matrix conductance solver (G·V = I)</w:t>
-            </w:r>
-          </w:p>
-        </w:tc>
-      </w:tr>
-      <w:tr>
-        <w:trPr>
-          <w:jc w:val="center"/>
-        </w:trPr>
-        <w:tc>
-          <w:tcPr>
-            <w:tcW w:w="3106" w:type="dxa"/>
-            <w:shd w:val="clear" w:color="auto" w:fill="F7FAFC"/>
-          </w:tcPr>
-          <w:p>
-            <w:pPr>
-              <w:spacing w:after="40"/>
-            </w:pPr>
-            <w:r>
-              <w:rPr>
-                <w:sz w:val="16"/>
-              </w:rPr>
-              <w:t>Falstad Online Circuit Simulation</w:t>
-            </w:r>
-          </w:p>
-        </w:tc>
-        <w:tc>
-          <w:tcPr>
-            <w:tcW w:w="3106" w:type="dxa"/>
-            <w:shd w:val="clear" w:color="auto" w:fill="F7FAFC"/>
-          </w:tcPr>
-          <w:p>
-            <w:pPr>
-              <w:spacing w:after="40"/>
-            </w:pPr>
-            <w:r>
-              <w:rPr>
-                <w:sz w:val="16"/>
-              </w:rPr>
-              <w:t>Lead: Building 13 circuit models in Falstad, capturing digital probes, logging results</w:t>
-            </w:r>
-          </w:p>
-        </w:tc>
-        <w:tc>
-          <w:tcPr>
-            <w:tcW w:w="3106" w:type="dxa"/>
-            <w:shd w:val="clear" w:color="auto" w:fill="F7FAFC"/>
-          </w:tcPr>
-          <w:p>
-            <w:pPr>
-              <w:spacing w:after="40"/>
-            </w:pPr>
-            <w:r>
-              <w:rPr>
-                <w:sz w:val="16"/>
-              </w:rPr>
-              <w:t>Support: Creating automated ASCII schematic exporter and clickable web URLs</w:t>
-            </w:r>
-          </w:p>
-        </w:tc>
-      </w:tr>
-      <w:tr>
-        <w:trPr>
-          <w:jc w:val="center"/>
-        </w:trPr>
-        <w:tc>
-          <w:tcPr>
-            <w:tcW w:w="3106" w:type="dxa"/>
-            <w:shd w:val="clear" w:color="auto" w:fill="FFFFFF"/>
-          </w:tcPr>
-          <w:p>
-            <w:pPr>
-              <w:spacing w:after="40"/>
-            </w:pPr>
-            <w:r>
-              <w:rPr>
-                <w:sz w:val="16"/>
-              </w:rPr>
-              <w:t>Machine Learning &amp; Diagnostics</w:t>
-            </w:r>
-          </w:p>
-        </w:tc>
-        <w:tc>
-          <w:tcPr>
-            <w:tcW w:w="3106" w:type="dxa"/>
-            <w:shd w:val="clear" w:color="auto" w:fill="FFFFFF"/>
-          </w:tcPr>
-          <w:p>
-            <w:pPr>
-              <w:spacing w:after="40"/>
-            </w:pPr>
-            <w:r>
-              <w:rPr>
-                <w:sz w:val="16"/>
-              </w:rPr>
-              <w:t>Support: Validating component tolerance bands (5%) and physical constraints</w:t>
-            </w:r>
-          </w:p>
-        </w:tc>
-        <w:tc>
-          <w:tcPr>
-            <w:tcW w:w="3106" w:type="dxa"/>
-            <w:shd w:val="clear" w:color="auto" w:fill="FFFFFF"/>
-          </w:tcPr>
-          <w:p>
-            <w:pPr>
-              <w:spacing w:after="40"/>
-            </w:pPr>
-            <w:r>
-              <w:rPr>
-                <w:sz w:val="16"/>
-              </w:rPr>
-              <w:t>Lead: Implementing Z-score standardization, Nearest Centroid Classifier, and margin score</w:t>
-            </w:r>
-          </w:p>
-        </w:tc>
-      </w:tr>
-      <w:tr>
-        <w:trPr>
-          <w:jc w:val="center"/>
-        </w:trPr>
-        <w:tc>
-          <w:tcPr>
-            <w:tcW w:w="3106" w:type="dxa"/>
-            <w:shd w:val="clear" w:color="auto" w:fill="F7FAFC"/>
-          </w:tcPr>
-          <w:p>
-            <w:pPr>
-              <w:spacing w:after="40"/>
-            </w:pPr>
-            <w:r>
-              <w:rPr>
-                <w:sz w:val="16"/>
-              </w:rPr>
-              <w:t>User Interface &amp; Testing</w:t>
-            </w:r>
-          </w:p>
-        </w:tc>
-        <w:tc>
-          <w:tcPr>
-            <w:tcW w:w="3106" w:type="dxa"/>
-            <w:shd w:val="clear" w:color="auto" w:fill="F7FAFC"/>
-          </w:tcPr>
-          <w:p>
-            <w:pPr>
-              <w:spacing w:after="40"/>
-            </w:pPr>
-            <w:r>
-              <w:rPr>
-                <w:sz w:val="16"/>
-              </w:rPr>
-              <w:t>Support: Telemetry checking, UI testing, and conducting manual probe verifications</w:t>
-            </w:r>
-          </w:p>
-        </w:tc>
-        <w:tc>
-          <w:tcPr>
-            <w:tcW w:w="3106" w:type="dxa"/>
-            <w:shd w:val="clear" w:color="auto" w:fill="F7FAFC"/>
-          </w:tcPr>
-          <w:p>
-            <w:pPr>
-              <w:spacing w:after="40"/>
-            </w:pPr>
-            <w:r>
-              <w:rPr>
-                <w:sz w:val="16"/>
-              </w:rPr>
-              <w:t>Lead: Streamlit web app (`app.py`), Tkinter desktop GUI (`gui_tk.py`), and 22 unit tests</w:t>
-            </w:r>
-          </w:p>
-        </w:tc>
-      </w:tr>
-      <w:tr>
-        <w:trPr>
-          <w:jc w:val="center"/>
-        </w:trPr>
-        <w:tc>
-          <w:tcPr>
-            <w:tcW w:w="3106" w:type="dxa"/>
-            <w:shd w:val="clear" w:color="auto" w:fill="FFFFFF"/>
-          </w:tcPr>
-          <w:p>
-            <w:pPr>
-              <w:spacing w:after="40"/>
-            </w:pPr>
-            <w:r>
-              <w:rPr>
-                <w:sz w:val="16"/>
-              </w:rPr>
-              <w:t>Documentation &amp; Viva Preparation</w:t>
-            </w:r>
-          </w:p>
-        </w:tc>
-        <w:tc>
-          <w:tcPr>
-            <w:tcW w:w="3106" w:type="dxa"/>
-            <w:shd w:val="clear" w:color="auto" w:fill="FFFFFF"/>
-          </w:tcPr>
-          <w:p>
-            <w:pPr>
-              <w:spacing w:after="40"/>
-            </w:pPr>
-            <w:r>
-              <w:rPr>
-                <w:sz w:val="16"/>
-              </w:rPr>
-              <w:t>Shared: BEEE theory writeup, Viva Q&amp;A preparation, reviewing report calculations</w:t>
-            </w:r>
-          </w:p>
-        </w:tc>
-        <w:tc>
-          <w:tcPr>
-            <w:tcW w:w="3106" w:type="dxa"/>
-            <w:shd w:val="clear" w:color="auto" w:fill="FFFFFF"/>
-          </w:tcPr>
-          <w:p>
-            <w:pPr>
-              <w:spacing w:after="40"/>
-            </w:pPr>
-            <w:r>
-              <w:rPr>
-                <w:sz w:val="16"/>
-              </w:rPr>
-              <w:t>Shared: ML methodology writeup, PPT slides, live demonstration script</w:t>
-            </w:r>
-          </w:p>
-        </w:tc>
-      </w:tr>
-    </w:tbl>
+    <w:p>
+      <w:pPr>
+        <w:spacing w:after="60"/>
+        <w:ind w:left="432" w:hanging="432"/>
+      </w:pPr>
+      <w:r>
+        <w:rPr>
+          <w:rFonts w:ascii="Calibri" w:hAnsi="Calibri"/>
+          <w:color w:val="2D3748"/>
+          <w:sz w:val="18"/>
+        </w:rPr>
+        <w:t>[5] J. W. Bandler and A. E. Salama, "Fault diagnosis of analog circuits," Proceedings of the IEEE, vol. 73, no. 8, pp. 1279–1325, Aug. 1985.</w:t>
+      </w:r>
+    </w:p>
+    <w:p>
+      <w:pPr>
+        <w:spacing w:after="60"/>
+        <w:ind w:left="432" w:hanging="432"/>
+      </w:pPr>
+      <w:r>
+        <w:rPr>
+          <w:rFonts w:ascii="Calibri" w:hAnsi="Calibri"/>
+          <w:color w:val="2D3748"/>
+          <w:sz w:val="18"/>
+        </w:rPr>
+        <w:t>[6] R. Isermann, Fault-Diagnosis Systems: An Introduction from Fault Detection to Fault Tolerance. Berlin, Germany: Springer-Verlag, 2006.</w:t>
+      </w:r>
+    </w:p>
+    <w:p>
+      <w:pPr>
+        <w:spacing w:after="60"/>
+        <w:ind w:left="432" w:hanging="432"/>
+      </w:pPr>
+      <w:r>
+        <w:rPr>
+          <w:rFonts w:ascii="Calibri" w:hAnsi="Calibri"/>
+          <w:color w:val="2D3748"/>
+          <w:sz w:val="18"/>
+        </w:rPr>
+        <w:t>[7] T. Hastie, R. Tibshirani, and J. Friedman, The Elements of Statistical Learning: Data Mining, Inference, and Prediction, 2nd ed. New York, NY: Springer, 2009.</w:t>
+      </w:r>
+    </w:p>
+    <w:p>
+      <w:pPr>
+        <w:spacing w:after="60"/>
+        <w:ind w:left="432" w:hanging="432"/>
+      </w:pPr>
+      <w:r>
+        <w:rPr>
+          <w:rFonts w:ascii="Calibri" w:hAnsi="Calibri"/>
+          <w:color w:val="2D3748"/>
+          <w:sz w:val="18"/>
+        </w:rPr>
+        <w:t>[8] R. O. Duda, P. E. Hart, and D. G. Stork, Pattern Classification, 2nd ed. New York, NY, USA: John Wiley &amp; Sons, 2001.</w:t>
+      </w:r>
+    </w:p>
     <w:p>
       <w:pPr>
         <w:keepNext/>
@@ -4879,12 +4478,54 @@
           <w:b/>
           <w:color w:val="2B6CB0"/>
         </w:rPr>
-        <w:t>3. Essential Run Instructions</w:t>
+        <w:t>3. Simulation Platforms, Scientific Libraries, and Standards</w:t>
       </w:r>
     </w:p>
     <w:p>
       <w:pPr>
-        <w:spacing w:after="40" w:line="269" w:lineRule="auto"/>
+        <w:spacing w:after="60"/>
+        <w:ind w:left="432" w:hanging="432"/>
+      </w:pPr>
+      <w:r>
+        <w:rPr>
+          <w:rFonts w:ascii="Calibri" w:hAnsi="Calibri"/>
+          <w:color w:val="2D3748"/>
+          <w:sz w:val="18"/>
+        </w:rPr>
+        <w:t>[9] P. Falstad, "Circuit Simulator Applet (Online SPICE engine)," Falstad.com, 2023. [Online]. Available: https://www.falstad.com/circuit/ [Accessed: Oct. 2026].</w:t>
+      </w:r>
+    </w:p>
+    <w:p>
+      <w:pPr>
+        <w:spacing w:after="60"/>
+        <w:ind w:left="432" w:hanging="432"/>
+      </w:pPr>
+      <w:r>
+        <w:rPr>
+          <w:rFonts w:ascii="Calibri" w:hAnsi="Calibri"/>
+          <w:color w:val="2D3748"/>
+          <w:sz w:val="18"/>
+        </w:rPr>
+        <w:t>[10] F. Pedregosa et al., "Scikit-learn: Machine learning in Python," Journal of Machine Learning Research, vol. 12, pp. 2825–2830, 2011.</w:t>
+      </w:r>
+    </w:p>
+    <w:p>
+      <w:pPr>
+        <w:spacing w:after="60"/>
+        <w:ind w:left="432" w:hanging="432"/>
+      </w:pPr>
+      <w:r>
+        <w:rPr>
+          <w:rFonts w:ascii="Calibri" w:hAnsi="Calibri"/>
+          <w:color w:val="2D3748"/>
+          <w:sz w:val="18"/>
+        </w:rPr>
+        <w:t>[11] C. R. Harris et al., "Array programming with NumPy," Nature, vol. 585, no. 7825, pp. 357–362, Sep. 2020.</w:t>
+      </w:r>
+    </w:p>
+    <w:p>
+      <w:pPr>
+        <w:spacing w:after="80" w:line="269" w:lineRule="auto"/>
       </w:pPr>
       <w:r>
         <w:rPr>
@@ -4893,16 +4534,7 @@
           <w:color w:val="2D3748"/>
           <w:sz w:val="19"/>
         </w:rPr>
-        <w:t>Quick Execution Commands:</w:t>
-      </w:r>
-      <w:r>
-        <w:rPr>
-          <w:rFonts w:ascii="Calibri" w:hAnsi="Calibri"/>
-          <w:b/>
-          <w:color w:val="2D3748"/>
-          <w:sz w:val="19"/>
-        </w:rPr>
-        <w:br/>
+        <w:t xml:space="preserve">Academic Integrity &amp; Verification Note: </w:t>
       </w:r>
       <w:r>
         <w:rPr>
@@ -4910,41 +4542,7 @@
           <w:color w:val="2D3748"/>
           <w:sz w:val="19"/>
         </w:rPr>
-        <w:t>• Install dependencies: pip install -r requirements.txt</w:t>
-      </w:r>
-      <w:r>
-        <w:rPr>
-          <w:rFonts w:ascii="Calibri" w:hAnsi="Calibri"/>
-          <w:color w:val="2D3748"/>
-          <w:sz w:val="19"/>
-        </w:rPr>
-        <w:br/>
-        <w:t>• Run 22 unit tests: python -m pytest tests/ -v</w:t>
-      </w:r>
-      <w:r>
-        <w:rPr>
-          <w:rFonts w:ascii="Calibri" w:hAnsi="Calibri"/>
-          <w:color w:val="2D3748"/>
-          <w:sz w:val="19"/>
-        </w:rPr>
-        <w:br/>
-        <w:t>• Launch interactive web interface: streamlit run app.py</w:t>
-      </w:r>
-      <w:r>
-        <w:rPr>
-          <w:rFonts w:ascii="Calibri" w:hAnsi="Calibri"/>
-          <w:color w:val="2D3748"/>
-          <w:sz w:val="19"/>
-        </w:rPr>
-        <w:br/>
-      </w:r>
-      <w:r>
-        <w:rPr>
-          <w:rFonts w:ascii="Calibri" w:hAnsi="Calibri"/>
-          <w:color w:val="2D3748"/>
-          <w:sz w:val="19"/>
-        </w:rPr>
-        <w:t>• Launch offline desktop interface: python gui_tk.py</w:t>
+        <w:t>All analytical nodal derivations, circuit models, stochastic evaluations, and software implementations documented in this report were developed for the course Basic Electrical and Electronics Engineering (BEEE), School of Electrical Engineering (SELECT), Vellore Institute of Technology (VIT), Vellore.</w:t>
       </w:r>
     </w:p>
     <w:sectPr>
@@ -5200,31 +4798,31 @@
       </w:rPr>
     </w:lvl>
   </w:abstractNum>
-  <w:num w:numId="1" w16cid:durableId="1051463782">
+  <w:num w:numId="1" w16cid:durableId="1121340287">
     <w:abstractNumId w:val="8"/>
   </w:num>
-  <w:num w:numId="2" w16cid:durableId="1218784986">
+  <w:num w:numId="2" w16cid:durableId="1809590251">
     <w:abstractNumId w:val="6"/>
   </w:num>
-  <w:num w:numId="3" w16cid:durableId="2101641078">
+  <w:num w:numId="3" w16cid:durableId="238178014">
     <w:abstractNumId w:val="5"/>
   </w:num>
-  <w:num w:numId="4" w16cid:durableId="421340501">
+  <w:num w:numId="4" w16cid:durableId="1244686264">
     <w:abstractNumId w:val="4"/>
   </w:num>
-  <w:num w:numId="5" w16cid:durableId="1272512667">
+  <w:num w:numId="5" w16cid:durableId="806509466">
     <w:abstractNumId w:val="7"/>
   </w:num>
-  <w:num w:numId="6" w16cid:durableId="1645966038">
+  <w:num w:numId="6" w16cid:durableId="1380472814">
     <w:abstractNumId w:val="3"/>
   </w:num>
-  <w:num w:numId="7" w16cid:durableId="228854604">
+  <w:num w:numId="7" w16cid:durableId="593131209">
     <w:abstractNumId w:val="2"/>
   </w:num>
-  <w:num w:numId="8" w16cid:durableId="919800233">
+  <w:num w:numId="8" w16cid:durableId="1118334905">
     <w:abstractNumId w:val="1"/>
   </w:num>
-  <w:num w:numId="9" w16cid:durableId="1991591588">
+  <w:num w:numId="9" w16cid:durableId="1100763181">
     <w:abstractNumId w:val="0"/>
   </w:num>
 </w:numbering>

</xml_diff>

<commit_message>
docs(report): update reports to describe all 8 Streamlit tabs, breadboard wiring, and 3D feature space
</commit_message>
<xml_diff>
--- a/report/BEEE_Circuit_Doctor_Project_Report.docx
+++ b/report/BEEE_Circuit_Doctor_Project_Report.docx
@@ -164,6 +164,8 @@
             </w:r>
             <w:r>
               <w:br/>
+            </w:r>
+            <w:r>
               <w:t>Branch: CSE (SCOPE)</w:t>
             </w:r>
           </w:p>
@@ -300,20 +302,36 @@
           <w:color w:val="2D3748"/>
           <w:sz w:val="19"/>
         </w:rPr>
-        <w:t>Diagnosing electrical faults quickly and reliably is critical in automotive electronics, industrial control switchboards, and consumer power supplies. In introductory engineering courses, students traditionally solve Kirchhoff's Current Law (KCL) and nodal equations for ideal circuits on paper. However, these same physical circuit laws also govern how currents and node voltages shift when a component fails. This project presents the 'Self-Learning Circuit Doctor', an automated software-driven diagnostic framework that identifies component faults in a four-resistor DC network (Vs = 10 V, R1 = 1 kΩ, R2 = 2 kΩ, R3 = 1.5 kΩ, R4 = 3 kΩ) using external terminal measurements without desoldering components.</w:t>
-      </w:r>
-    </w:p>
-    <w:p>
-      <w:pPr>
-        <w:spacing w:after="80" w:line="269" w:lineRule="auto"/>
-      </w:pPr>
+        <w:t>Diagnosing electrical faults quickly and reliably is critical in automotive electronics, industrial control switchboards, and consumer power supplies. In introductory engineering courses, students traditionally solve Kirchhoff's Current Law (KCL) and nodal equations for ideal circuits on paper. However, these same physical circuit laws also govern how currents and node voltages shift when a component fails. This project presents the 'Self-Learning Circuit Doctor', an automated software-driven diagnostic fra</w:t>
+      </w:r>
       <w:r>
         <w:rPr>
           <w:rFonts w:ascii="Calibri" w:hAnsi="Calibri"/>
           <w:color w:val="2D3748"/>
           <w:sz w:val="19"/>
         </w:rPr>
-        <w:t>By monitoring a three-dimensional signature vector—Node A voltage (VA), Node B voltage (VB), and total source current (Is)—the system maps the operating state into a standardized feature space. Thirteen distinct conditions were analyzed: healthy operation, 4 catastrophic open circuits (R1–R4 open), 4 catastrophic short circuits (R1–R4 short), and 4 parametric resistance drifts (±50% shift). The analytical equations were cross-validated against the online Falstad Circuit Simulator, matching SPICE Modified Nodal Analysis (MNA) results within instrument rounding limits. Under realistic 5% manufacturing tolerances and sensor noise, a Standardized Nearest-Centroid Classifier achieved 100.00% accuracy across 390 held-out test samples.</w:t>
+        <w:t>mework that identifies component faults in a four-resistor DC network (Vs = 10 V, R1 = 1 kΩ, R2 = 2 kΩ, R3 = 1.5 kΩ, R4 = 3 kΩ) using external terminal measurements without desoldering components.</w:t>
+      </w:r>
+    </w:p>
+    <w:p>
+      <w:pPr>
+        <w:spacing w:after="80" w:line="269" w:lineRule="auto"/>
+      </w:pPr>
+      <w:r>
+        <w:rPr>
+          <w:rFonts w:ascii="Calibri" w:hAnsi="Calibri"/>
+          <w:color w:val="2D3748"/>
+          <w:sz w:val="19"/>
+        </w:rPr>
+        <w:t>By monitoring a three-dimensional signature vector—Node A voltage (VA), Node B voltage (VB), and total source current (Is)—the system maps the operating state into a standardized feature space. Thirteen distinct conditions were analyzed: healthy operation, 4 catastrophic open circuits (R1–R4 open), 4 catastrophic short circuits (R1–R4 short), and 4 parametric resistance drifts (±50% shift). The analytical equations were cross-validated against the online Falstad Circuit Simulator, matching SPICE Modified No</w:t>
+      </w:r>
+      <w:r>
+        <w:rPr>
+          <w:rFonts w:ascii="Calibri" w:hAnsi="Calibri"/>
+          <w:color w:val="2D3748"/>
+          <w:sz w:val="19"/>
+        </w:rPr>
+        <w:t>dal Analysis (MNA) results within instrument rounding limits. Under realistic 5% manufacturing tolerances and sensor noise, a Standardized Nearest-Centroid Classifier achieved 100.00% accuracy across 390 held-out test samples.</w:t>
       </w:r>
     </w:p>
     <w:p>
@@ -690,7 +708,15 @@
           <w:color w:val="2D3748"/>
           <w:sz w:val="19"/>
         </w:rPr>
-        <w:t>When an electronic assembly fails in the field, technicians often cannot desolder each component sequentially to measure its resistance on an ohmmeter. Doing so damages copper PCB pads and consumes valuable time. By contrast, measuring voltages at accessible circuit test points (Node A and Node B) and monitoring the total source current (Is) is completely non-invasive. Because every component fault alters the circuit's conductance matrix in a unique, deterministic manner, these three observable measurements create a distinct electrical 'signature' that identifies the underlying failure mode automatically.</w:t>
+        <w:t>When an electronic assembly fails in the field, technicians often cannot desolder each component sequentially to measure its resistance on an ohmmeter. Doing so damages copper PCB pads and consumes valuable time. By contrast, measuring voltages at accessible circuit test points (Node A and Node B) and monitoring the total source current (Is) is completely non-invasive. Because every component fault alters the circuit's conductance matrix in a unique, deterministic manner, these three observable measurements</w:t>
+      </w:r>
+      <w:r>
+        <w:rPr>
+          <w:rFonts w:ascii="Calibri" w:hAnsi="Calibri"/>
+          <w:color w:val="2D3748"/>
+          <w:sz w:val="19"/>
+        </w:rPr>
+        <w:t xml:space="preserve"> create a distinct electrical 'signature' that identifies the underlying failure mode automatically.</w:t>
       </w:r>
     </w:p>
     <w:p>
@@ -765,7 +791,15 @@
           <w:color w:val="2D3748"/>
           <w:sz w:val="19"/>
         </w:rPr>
-        <w:t>Circuit fault diagnosis has been studied extensively in electrical engineering. Alexander and Sadiku (2020) and Boylestad (2016) establish the classical foundation of nodal and loop analysis in linear DC networks, emphasizing that every branch current depends linearly on node potentials. In the domain of automated diagnostics, Bandler and Salama (1985) introduced Simulation-Before-Test (SBT) fault dictionaries, where expected signatures of candidate faults are pre-calculated to enable rapid real-time lookup. Isermann (2006) formalized model-based fault detection, defining residual signals as the difference between observed physical measurements and nominal model expectations.</w:t>
+        <w:t>Circuit fault diagnosis has been studied extensively in electrical engineering. Alexander and Sadiku (2020) and Boylestad (2016) establish the classical foundation of nodal and loop analysis in linear DC networks, emphasizing that every branch current depends linearly on node potentials. In the domain of automated diagnostics, Bandler and Salama (1985) introduced Simulation-Before-Test (SBT) fault dictionaries, where expected signatures of candidate faults are pre-calculated to enable rapid real-time lookup</w:t>
+      </w:r>
+      <w:r>
+        <w:rPr>
+          <w:rFonts w:ascii="Calibri" w:hAnsi="Calibri"/>
+          <w:color w:val="2D3748"/>
+          <w:sz w:val="19"/>
+        </w:rPr>
+        <w:t>. Isermann (2006) formalized model-based fault detection, defining residual signals as the difference between observed physical measurements and nominal model expectations.</w:t>
       </w:r>
     </w:p>
     <w:p>
@@ -1021,7 +1055,7 @@
           <w:noProof/>
         </w:rPr>
         <w:drawing>
-          <wp:inline distT="0" distB="0" distL="0" distR="0" wp14:anchorId="187DAC7E" wp14:editId="284F11C7">
+          <wp:inline distT="0" distB="0" distL="0" distR="0" wp14:anchorId="6ABA07A7" wp14:editId="7DC47B2A">
             <wp:extent cx="4206240" cy="2079489"/>
             <wp:effectExtent l="0" t="0" r="0" b="0"/>
             <wp:docPr id="1" name="Picture 1"/>
@@ -1150,6 +1184,13 @@
           <w:sz w:val="19"/>
         </w:rPr>
         <w:br/>
+      </w:r>
+      <w:r>
+        <w:rPr>
+          <w:rFonts w:ascii="Calibri" w:hAnsi="Calibri"/>
+          <w:color w:val="2D3748"/>
+          <w:sz w:val="19"/>
+        </w:rPr>
         <w:t>Calculating the source current and node voltages:</w:t>
       </w:r>
       <w:r>
@@ -1324,6 +1365,13 @@
           <w:sz w:val="19"/>
         </w:rPr>
         <w:br/>
+      </w:r>
+      <w:r>
+        <w:rPr>
+          <w:rFonts w:ascii="Calibri" w:hAnsi="Calibri"/>
+          <w:color w:val="2D3748"/>
+          <w:sz w:val="19"/>
+        </w:rPr>
         <w:t>The dataset was split using a stratified 80/20 partition: 1,560 training samples and 390 held-out test samples. Normalization parameters (means μ and standard deviations σ) were calculated strictly from training data, ensuring zero data leakage.</w:t>
       </w:r>
     </w:p>
@@ -1360,6 +1408,13 @@
           <w:sz w:val="19"/>
         </w:rPr>
         <w:br/>
+      </w:r>
+      <w:r>
+        <w:rPr>
+          <w:rFonts w:ascii="Calibri" w:hAnsi="Calibri"/>
+          <w:color w:val="2D3748"/>
+          <w:sz w:val="19"/>
+        </w:rPr>
         <w:t>• Method B (Standardized Nearest-Centroid Classifier): Projects features into Z-scores: Z_j = (X_j - μ_j) / σ_j. It calculates the standardized Euclidean distance to all 13 class centroids: d_k = || Z - μ_k ||. The class with the minimum distance is predicted: c* = argmin(d_k).</w:t>
       </w:r>
       <w:r>
@@ -1432,7 +1487,7 @@
           <w:color w:val="2D3748"/>
           <w:sz w:val="19"/>
         </w:rPr>
-        <w:t>The software was implemented in Python 3.14 using NumPy, Pandas, Scikit-Learn, and Matplotlib. Dual interfaces were created: an interactive web application in Streamlit (`app.py`) and a 100% offline desktop application in Tkinter (`gui_tk.py`).</w:t>
+        <w:t>The software was implemented in Python 3.14 using NumPy, Pandas, Scikit-Learn, and Matplotlib. Dual interfaces were created: an interactive web application in Streamlit (`app.py`, featuring 8 dedicated tabs including physical breadboard wiring, fault topologies, and 3D feature space clustering) and a 100% offline desktop application in Tkinter (`gui_tk.py`).</w:t>
       </w:r>
     </w:p>
     <w:p>
@@ -3950,7 +4005,7 @@
           <w:noProof/>
         </w:rPr>
         <w:drawing>
-          <wp:inline distT="0" distB="0" distL="0" distR="0" wp14:anchorId="7C69B503" wp14:editId="7E523D5B">
+          <wp:inline distT="0" distB="0" distL="0" distR="0" wp14:anchorId="75B5F0DE" wp14:editId="5FE6632B">
             <wp:extent cx="3474720" cy="3166123"/>
             <wp:effectExtent l="0" t="0" r="0" b="0"/>
             <wp:docPr id="2" name="Picture 2"/>
@@ -4100,7 +4155,15 @@
           <w:color w:val="2D3748"/>
           <w:sz w:val="19"/>
         </w:rPr>
-        <w:t>This project successfully developed the 'Self-Learning Circuit Doctor', an automated fault diagnostic system for DC resistor networks. We formulated exact closed-form nodal equations, cross-validated nominal and faulty states against the online Falstad SPICE simulator, and demonstrated that a three-dimensional signature vector [VA, VB, Is] cleanly separates 13 distinct circuit conditions. A Standardized Nearest-Centroid Classifier achieved 100.00% accuracy on 390 test samples with 5% component tolerances and sensor noise. Both an interactive web app (Streamlit) and a zero-dependency offline desktop GUI (Tkinter) were deployed alongside 22 automated passing unit tests.</w:t>
+        <w:t>This project successfully developed the 'Self-Learning Circuit Doctor', an automated fault diagnostic system for DC resistor networks. We formulated exact closed-form nodal equations, cross-validated nominal and faulty states against the online Falstad SPICE simulator, and demonstrated that a three-dimensional signature vector [VA, VB, Is] cleanly separates 13 distinct circuit conditions. A Standardized Nearest-Centroid Classifier achieved 100.00% accuracy on 390 test samples with 5% component tolerances an</w:t>
+      </w:r>
+      <w:r>
+        <w:rPr>
+          <w:rFonts w:ascii="Calibri" w:hAnsi="Calibri"/>
+          <w:color w:val="2D3748"/>
+          <w:sz w:val="19"/>
+        </w:rPr>
+        <w:t>d sensor noise. Both an interactive web app (Streamlit) and a zero-dependency offline desktop GUI (Tkinter) were deployed alongside 22 automated passing unit tests.</w:t>
       </w:r>
     </w:p>
     <w:p>
@@ -4798,31 +4861,31 @@
       </w:rPr>
     </w:lvl>
   </w:abstractNum>
-  <w:num w:numId="1" w16cid:durableId="1121340287">
+  <w:num w:numId="1" w16cid:durableId="1553036996">
     <w:abstractNumId w:val="8"/>
   </w:num>
-  <w:num w:numId="2" w16cid:durableId="1809590251">
+  <w:num w:numId="2" w16cid:durableId="1287589647">
     <w:abstractNumId w:val="6"/>
   </w:num>
-  <w:num w:numId="3" w16cid:durableId="238178014">
+  <w:num w:numId="3" w16cid:durableId="352191500">
     <w:abstractNumId w:val="5"/>
   </w:num>
-  <w:num w:numId="4" w16cid:durableId="1244686264">
+  <w:num w:numId="4" w16cid:durableId="1829708937">
     <w:abstractNumId w:val="4"/>
   </w:num>
-  <w:num w:numId="5" w16cid:durableId="806509466">
+  <w:num w:numId="5" w16cid:durableId="1260258102">
     <w:abstractNumId w:val="7"/>
   </w:num>
-  <w:num w:numId="6" w16cid:durableId="1380472814">
+  <w:num w:numId="6" w16cid:durableId="513106400">
     <w:abstractNumId w:val="3"/>
   </w:num>
-  <w:num w:numId="7" w16cid:durableId="593131209">
+  <w:num w:numId="7" w16cid:durableId="419644074">
     <w:abstractNumId w:val="2"/>
   </w:num>
-  <w:num w:numId="8" w16cid:durableId="1118334905">
+  <w:num w:numId="8" w16cid:durableId="1298678528">
     <w:abstractNumId w:val="1"/>
   </w:num>
-  <w:num w:numId="9" w16cid:durableId="1100763181">
+  <w:num w:numId="9" w16cid:durableId="1683169868">
     <w:abstractNumId w:val="0"/>
   </w:num>
 </w:numbering>

</xml_diff>

<commit_message>
docs: finalize reports with virtual workbench, breadboard wiring studio, and embedded Falstad canvas details
</commit_message>
<xml_diff>
--- a/report/BEEE_Circuit_Doctor_Project_Report.docx
+++ b/report/BEEE_Circuit_Doctor_Project_Report.docx
@@ -1055,7 +1055,7 @@
           <w:noProof/>
         </w:rPr>
         <w:drawing>
-          <wp:inline distT="0" distB="0" distL="0" distR="0" wp14:anchorId="6ABA07A7" wp14:editId="7DC47B2A">
+          <wp:inline distT="0" distB="0" distL="0" distR="0" wp14:anchorId="431CFE81" wp14:editId="4A5C6D0F">
             <wp:extent cx="4206240" cy="2079489"/>
             <wp:effectExtent l="0" t="0" r="0" b="0"/>
             <wp:docPr id="1" name="Picture 1"/>
@@ -1474,7 +1474,7 @@
           <w:b/>
           <w:color w:val="2B6CB0"/>
         </w:rPr>
-        <w:t>5. Software Implementation Tools</w:t>
+        <w:t>5. Software Architecture and Interactive Workbench</w:t>
       </w:r>
     </w:p>
     <w:p>
@@ -1487,7 +1487,7 @@
           <w:color w:val="2D3748"/>
           <w:sz w:val="19"/>
         </w:rPr>
-        <w:t>The software was implemented in Python 3.14 using NumPy, Pandas, Scikit-Learn, and Matplotlib. Dual interfaces were created: an interactive web application in Streamlit (`app.py`, featuring 8 dedicated tabs including physical breadboard wiring, fault topologies, and 3D feature space clustering) and a 100% offline desktop application in Tkinter (`gui_tk.py`).</w:t>
+        <w:t>The software was implemented in Python 3.14 across dual interfaces: (1) an interactive web platform in Streamlit (`app.py`, featuring 8 dedicated tabs including a Virtual Circuit Workbench for custom component/source values, branch execution tables with energy balances, an interactive breadboard studio with pin-by-pin continuity verification, live embedded Falstad schematic canvas, fault topologies, and 3D clustering) and (2) an offline desktop GUI in Tkinter (`gui_tk.py`).</w:t>
       </w:r>
     </w:p>
     <w:p>
@@ -4005,7 +4005,7 @@
           <w:noProof/>
         </w:rPr>
         <w:drawing>
-          <wp:inline distT="0" distB="0" distL="0" distR="0" wp14:anchorId="75B5F0DE" wp14:editId="5FE6632B">
+          <wp:inline distT="0" distB="0" distL="0" distR="0" wp14:anchorId="56D0BC41" wp14:editId="20D2E15B">
             <wp:extent cx="3474720" cy="3166123"/>
             <wp:effectExtent l="0" t="0" r="0" b="0"/>
             <wp:docPr id="2" name="Picture 2"/>
@@ -4861,31 +4861,31 @@
       </w:rPr>
     </w:lvl>
   </w:abstractNum>
-  <w:num w:numId="1" w16cid:durableId="1553036996">
+  <w:num w:numId="1" w16cid:durableId="393627153">
     <w:abstractNumId w:val="8"/>
   </w:num>
-  <w:num w:numId="2" w16cid:durableId="1287589647">
+  <w:num w:numId="2" w16cid:durableId="816920479">
     <w:abstractNumId w:val="6"/>
   </w:num>
-  <w:num w:numId="3" w16cid:durableId="352191500">
+  <w:num w:numId="3" w16cid:durableId="1732920814">
     <w:abstractNumId w:val="5"/>
   </w:num>
-  <w:num w:numId="4" w16cid:durableId="1829708937">
+  <w:num w:numId="4" w16cid:durableId="1776822229">
     <w:abstractNumId w:val="4"/>
   </w:num>
-  <w:num w:numId="5" w16cid:durableId="1260258102">
+  <w:num w:numId="5" w16cid:durableId="1375304142">
     <w:abstractNumId w:val="7"/>
   </w:num>
-  <w:num w:numId="6" w16cid:durableId="513106400">
+  <w:num w:numId="6" w16cid:durableId="1733455986">
     <w:abstractNumId w:val="3"/>
   </w:num>
-  <w:num w:numId="7" w16cid:durableId="419644074">
+  <w:num w:numId="7" w16cid:durableId="76827630">
     <w:abstractNumId w:val="2"/>
   </w:num>
-  <w:num w:numId="8" w16cid:durableId="1298678528">
+  <w:num w:numId="8" w16cid:durableId="1114209330">
     <w:abstractNumId w:val="1"/>
   </w:num>
-  <w:num w:numId="9" w16cid:durableId="1683169868">
+  <w:num w:numId="9" w16cid:durableId="2079594799">
     <w:abstractNumId w:val="0"/>
   </w:num>
 </w:numbering>

</xml_diff>